<commit_message>
syllabus: add tensor networks to Part 6 (Applications) in both docx and LaTeX syllabus
</commit_message>
<xml_diff>
--- a/syllabus/量子科学计算-研究生课程教学大纲.docx
+++ b/syllabus/量子科学计算-研究生课程教学大纲.docx
@@ -2120,15 +2120,15 @@
               <w:rPr>
                 <w:rFonts w:ascii="Times New Roman" w:hAnsi="Times New Roman" w:eastAsia="宋体"/>
               </w:rPr>
-              <w:t>6. 量子科学计算应用专题（含实践）：金融（期权定价、风险分析）；材料（特征值问题、电子结构）；机器学习（核方法、回归）；高维问题与量子优势；UnitaryLab 与 Agent Coding 实践。</w:t>
-            </w:r>
-          </w:p>
-          <w:p>
-            <w:r>
-              <w:rPr>
-                <w:rFonts w:ascii="Times New Roman" w:hAnsi="Times New Roman" w:eastAsia="宋体"/>
-              </w:rPr>
-              <w:t>Applications of quantum scientific computing (with practice): finance; materials; machine learning; high-dimensional problems and quantum advantage; UnitaryLab &amp; agent-coding lab.</w:t>
+              <w:t>6. 量子科学计算应用专题（含实践）：金融（期权定价、风险分析）；材料（特征值问题、电子结构）；机器学习（核方法、回归）；张量网络（tensor networks）；高维问题与量子优势；UnitaryLab 与 Agent Coding 实践。</w:t>
+            </w:r>
+          </w:p>
+          <w:p>
+            <w:r>
+              <w:rPr>
+                <w:rFonts w:ascii="Times New Roman" w:hAnsi="Times New Roman" w:eastAsia="宋体"/>
+              </w:rPr>
+              <w:t>Applications of quantum scientific computing (with practice): finance; materials; machine learning; tensor networks; high-dimensional problems and quantum advantage; UnitaryLab &amp; agent-coding lab.</w:t>
             </w:r>
           </w:p>
         </w:tc>

</xml_diff>

<commit_message>
source: register Chen Zhaoyun 量子计算算法教程 as course source (index + CLAUDE.md + syllabus refs)
</commit_message>
<xml_diff>
--- a/syllabus/量子科学计算-研究生课程教学大纲.docx
+++ b/syllabus/量子科学计算-研究生课程教学大纲.docx
@@ -2444,7 +2444,15 @@
               <w:rPr>
                 <w:rFonts w:ascii="Times New Roman" w:hAnsi="Times New Roman" w:eastAsia="宋体"/>
               </w:rPr>
-              <w:t>3. UnitaryLab, https://unitarylab.com/unitary-studio-test/</w:t>
+              <w:t>3. Chen Zhaoyun, 量子计算算法教程 (Quantum Computing Algorithms Tutorial), https://chenzhaoyun.com/quantum-tutorial/</w:t>
+            </w:r>
+          </w:p>
+          <w:p>
+            <w:r>
+              <w:rPr>
+                <w:rFonts w:ascii="Times New Roman" w:hAnsi="Times New Roman" w:eastAsia="宋体"/>
+              </w:rPr>
+              <w:t>4. UnitaryLab, https://unitarylab.com/unitary-studio-test/</w:t>
             </w:r>
           </w:p>
         </w:tc>

</xml_diff>